<commit_message>
Weeks Finished, Project Left
</commit_message>
<xml_diff>
--- a/Week-5/Exercise 05/Exercises 05.docx
+++ b/Week-5/Exercise 05/Exercises 05.docx
@@ -54,7 +54,15 @@
         </w:rPr>
       </w:pPr>
       <w:r>
-        <w:t>Download and store this document within your own filespace, so the contents can be edited. You will be able to refer to it during the test in Week 6.</w:t>
+        <w:t xml:space="preserve">Download and store this document within your own </w:t>
+      </w:r>
+      <w:proofErr w:type="spellStart"/>
+      <w:r>
+        <w:t>filespace</w:t>
+      </w:r>
+      <w:proofErr w:type="spellEnd"/>
+      <w:r>
+        <w:t>, so the contents can be edited. You will be able to refer to it during the test in Week 6.</w:t>
       </w:r>
     </w:p>
     <w:p>
@@ -171,7 +179,15 @@
         <w:spacing w:before="240"/>
       </w:pPr>
       <w:r>
-        <w:t>For more information about the module delivery, assessment and feedback please refer to the module within the MyBeckett portal.</w:t>
+        <w:t xml:space="preserve">For more information about the module delivery, assessment and feedback please refer to the module within the </w:t>
+      </w:r>
+      <w:proofErr w:type="spellStart"/>
+      <w:r>
+        <w:t>MyBeckett</w:t>
+      </w:r>
+      <w:proofErr w:type="spellEnd"/>
+      <w:r>
+        <w:t xml:space="preserve"> portal.</w:t>
       </w:r>
     </w:p>
     <w:p>
@@ -260,8 +276,13 @@
         <w:shd w:val="clear" w:color="auto" w:fill="FFF2CC"/>
       </w:pPr>
       <w:r>
-        <w:t>.py</w:t>
-      </w:r>
+        <w:t>.</w:t>
+      </w:r>
+      <w:proofErr w:type="spellStart"/>
+      <w:r>
+        <w:t>py</w:t>
+      </w:r>
+      <w:proofErr w:type="spellEnd"/>
     </w:p>
     <w:p>
       <w:pPr>
@@ -359,11 +380,19 @@
       <w:r>
         <w:t xml:space="preserve"> is executed from a file, are the results of evaluating expressions automatically displayed on the screen without the need of a </w:t>
       </w:r>
+      <w:proofErr w:type="gramStart"/>
       <w:r>
         <w:rPr>
           <w:rFonts w:ascii="Courier New" w:eastAsia="Courier New" w:hAnsi="Courier New" w:cs="Courier New"/>
         </w:rPr>
-        <w:t>print()</w:t>
+        <w:t>print(</w:t>
+      </w:r>
+      <w:proofErr w:type="gramEnd"/>
+      <w:r>
+        <w:rPr>
+          <w:rFonts w:ascii="Courier New" w:eastAsia="Courier New" w:hAnsi="Courier New" w:cs="Courier New"/>
+        </w:rPr>
+        <w:t>)</w:t>
       </w:r>
       <w:r>
         <w:t xml:space="preserve"> function call?</w:t>
@@ -394,7 +423,15 @@
         <w:shd w:val="clear" w:color="auto" w:fill="FFF2CC"/>
       </w:pPr>
       <w:r>
-        <w:t>No, when running a script from a file, expressions must use print() to display output, unlike in interactive mode.</w:t>
+        <w:t xml:space="preserve">No, when running a script from a file, expressions must use </w:t>
+      </w:r>
+      <w:proofErr w:type="gramStart"/>
+      <w:r>
+        <w:t>print(</w:t>
+      </w:r>
+      <w:proofErr w:type="gramEnd"/>
+      <w:r>
+        <w:t>) to display output, unlike in interactive mode.</w:t>
       </w:r>
     </w:p>
     <w:p>
@@ -486,7 +523,21 @@
         <w:rPr>
           <w:rFonts w:ascii="Roboto" w:eastAsia="Roboto" w:hAnsi="Roboto" w:cs="Roboto"/>
         </w:rPr>
-        <w:t>"John",  "Eric", "Graham"</w:t>
+        <w:t>"John</w:t>
+      </w:r>
+      <w:proofErr w:type="gramStart"/>
+      <w:r>
+        <w:rPr>
+          <w:rFonts w:ascii="Roboto" w:eastAsia="Roboto" w:hAnsi="Roboto" w:cs="Roboto"/>
+        </w:rPr>
+        <w:t>",  "</w:t>
+      </w:r>
+      <w:proofErr w:type="gramEnd"/>
+      <w:r>
+        <w:rPr>
+          <w:rFonts w:ascii="Roboto" w:eastAsia="Roboto" w:hAnsi="Roboto" w:cs="Roboto"/>
+        </w:rPr>
+        <w:t>Eric", "Graham"</w:t>
       </w:r>
       <w:r>
         <w:t xml:space="preserve"> as </w:t>
@@ -661,12 +712,16 @@
       <w:r>
         <w:t xml:space="preserve">What is the data-type of the </w:t>
       </w:r>
+      <w:proofErr w:type="spellStart"/>
+      <w:proofErr w:type="gramStart"/>
       <w:r>
         <w:rPr>
           <w:rFonts w:ascii="Courier New" w:eastAsia="Courier New" w:hAnsi="Courier New" w:cs="Courier New"/>
         </w:rPr>
         <w:t>sys.argv</w:t>
       </w:r>
+      <w:proofErr w:type="spellEnd"/>
+      <w:proofErr w:type="gramEnd"/>
       <w:r>
         <w:t xml:space="preserve"> variable?</w:t>
       </w:r>
@@ -695,8 +750,15 @@
         </w:pBdr>
         <w:shd w:val="clear" w:color="auto" w:fill="FFF2CC"/>
       </w:pPr>
-      <w:r>
-        <w:t>sys.argv is a list data type</w:t>
+      <w:proofErr w:type="spellStart"/>
+      <w:proofErr w:type="gramStart"/>
+      <w:r>
+        <w:t>sys.argv</w:t>
+      </w:r>
+      <w:proofErr w:type="spellEnd"/>
+      <w:proofErr w:type="gramEnd"/>
+      <w:r>
+        <w:t xml:space="preserve"> is a list data type</w:t>
       </w:r>
     </w:p>
     <w:p>
@@ -728,12 +790,16 @@
       <w:r>
         <w:t xml:space="preserve">What is stored within the first element of the </w:t>
       </w:r>
+      <w:proofErr w:type="spellStart"/>
+      <w:proofErr w:type="gramStart"/>
       <w:r>
         <w:rPr>
           <w:rFonts w:ascii="Courier New" w:eastAsia="Courier New" w:hAnsi="Courier New" w:cs="Courier New"/>
         </w:rPr>
         <w:t>sys.argv</w:t>
       </w:r>
+      <w:proofErr w:type="spellEnd"/>
+      <w:proofErr w:type="gramEnd"/>
       <w:r>
         <w:t xml:space="preserve"> variable?</w:t>
       </w:r>
@@ -763,7 +829,25 @@
         <w:shd w:val="clear" w:color="auto" w:fill="FFF2CC"/>
       </w:pPr>
       <w:r>
-        <w:t>The first element of sys.argv (sys.argv[0]) contains the script name/path.</w:t>
+        <w:t xml:space="preserve">The first element of </w:t>
+      </w:r>
+      <w:proofErr w:type="spellStart"/>
+      <w:proofErr w:type="gramStart"/>
+      <w:r>
+        <w:t>sys.argv</w:t>
+      </w:r>
+      <w:proofErr w:type="spellEnd"/>
+      <w:proofErr w:type="gramEnd"/>
+      <w:r>
+        <w:t xml:space="preserve"> (</w:t>
+      </w:r>
+      <w:proofErr w:type="spellStart"/>
+      <w:r>
+        <w:t>sys.argv</w:t>
+      </w:r>
+      <w:proofErr w:type="spellEnd"/>
+      <w:r>
+        <w:t>[0]) contains the script name/path.</w:t>
       </w:r>
     </w:p>
     <w:p>
@@ -870,21 +954,47 @@
         <w:shd w:val="clear" w:color="auto" w:fill="FFF2CC"/>
       </w:pPr>
       <w:r>
-        <w:t>for arg in sys.argv[1:]:</w:t>
-      </w:r>
-    </w:p>
-    <w:p>
-      <w:pPr>
-        <w:pBdr>
-          <w:top w:val="single" w:sz="8" w:space="0" w:color="000000"/>
-          <w:left w:val="single" w:sz="8" w:space="0" w:color="000000"/>
-          <w:bottom w:val="single" w:sz="8" w:space="0" w:color="000000"/>
-          <w:right w:val="single" w:sz="8" w:space="0" w:color="000000"/>
-        </w:pBdr>
-        <w:shd w:val="clear" w:color="auto" w:fill="FFF2CC"/>
-      </w:pPr>
-      <w:r>
-        <w:t xml:space="preserve">    print(arg)</w:t>
+        <w:t xml:space="preserve">for </w:t>
+      </w:r>
+      <w:proofErr w:type="spellStart"/>
+      <w:r>
+        <w:t>arg</w:t>
+      </w:r>
+      <w:proofErr w:type="spellEnd"/>
+      <w:r>
+        <w:t xml:space="preserve"> in </w:t>
+      </w:r>
+      <w:proofErr w:type="spellStart"/>
+      <w:proofErr w:type="gramStart"/>
+      <w:r>
+        <w:t>sys.argv</w:t>
+      </w:r>
+      <w:proofErr w:type="spellEnd"/>
+      <w:proofErr w:type="gramEnd"/>
+      <w:r>
+        <w:t>[1:]:</w:t>
+      </w:r>
+    </w:p>
+    <w:p>
+      <w:pPr>
+        <w:pBdr>
+          <w:top w:val="single" w:sz="8" w:space="0" w:color="000000"/>
+          <w:left w:val="single" w:sz="8" w:space="0" w:color="000000"/>
+          <w:bottom w:val="single" w:sz="8" w:space="0" w:color="000000"/>
+          <w:right w:val="single" w:sz="8" w:space="0" w:color="000000"/>
+        </w:pBdr>
+        <w:shd w:val="clear" w:color="auto" w:fill="FFF2CC"/>
+      </w:pPr>
+      <w:r>
+        <w:t xml:space="preserve">    print(</w:t>
+      </w:r>
+      <w:proofErr w:type="spellStart"/>
+      <w:r>
+        <w:t>arg</w:t>
+      </w:r>
+      <w:proofErr w:type="spellEnd"/>
+      <w:r>
+        <w:t>)</w:t>
       </w:r>
     </w:p>
     <w:p>
@@ -943,35 +1053,79 @@
         <w:shd w:val="clear" w:color="auto" w:fill="FFF2CC"/>
       </w:pPr>
       <w:r>
-        <w:t>if len(sys.argv) &gt; 1:</w:t>
-      </w:r>
-    </w:p>
-    <w:p>
-      <w:pPr>
-        <w:pBdr>
-          <w:top w:val="single" w:sz="8" w:space="0" w:color="000000"/>
-          <w:left w:val="single" w:sz="8" w:space="0" w:color="000000"/>
-          <w:bottom w:val="single" w:sz="8" w:space="0" w:color="000000"/>
-          <w:right w:val="single" w:sz="8" w:space="0" w:color="000000"/>
-        </w:pBdr>
-        <w:shd w:val="clear" w:color="auto" w:fill="FFF2CC"/>
-      </w:pPr>
-      <w:r>
-        <w:t xml:space="preserve">    for arg in sys.argv[1:]:</w:t>
-      </w:r>
-    </w:p>
-    <w:p>
-      <w:pPr>
-        <w:pBdr>
-          <w:top w:val="single" w:sz="8" w:space="0" w:color="000000"/>
-          <w:left w:val="single" w:sz="8" w:space="0" w:color="000000"/>
-          <w:bottom w:val="single" w:sz="8" w:space="0" w:color="000000"/>
-          <w:right w:val="single" w:sz="8" w:space="0" w:color="000000"/>
-        </w:pBdr>
-        <w:shd w:val="clear" w:color="auto" w:fill="FFF2CC"/>
-      </w:pPr>
-      <w:r>
-        <w:t xml:space="preserve">        print(arg)</w:t>
+        <w:t xml:space="preserve">if </w:t>
+      </w:r>
+      <w:proofErr w:type="spellStart"/>
+      <w:r>
+        <w:t>len</w:t>
+      </w:r>
+      <w:proofErr w:type="spellEnd"/>
+      <w:r>
+        <w:t>(</w:t>
+      </w:r>
+      <w:proofErr w:type="spellStart"/>
+      <w:proofErr w:type="gramStart"/>
+      <w:r>
+        <w:t>sys.argv</w:t>
+      </w:r>
+      <w:proofErr w:type="spellEnd"/>
+      <w:proofErr w:type="gramEnd"/>
+      <w:r>
+        <w:t>) &gt; 1:</w:t>
+      </w:r>
+    </w:p>
+    <w:p>
+      <w:pPr>
+        <w:pBdr>
+          <w:top w:val="single" w:sz="8" w:space="0" w:color="000000"/>
+          <w:left w:val="single" w:sz="8" w:space="0" w:color="000000"/>
+          <w:bottom w:val="single" w:sz="8" w:space="0" w:color="000000"/>
+          <w:right w:val="single" w:sz="8" w:space="0" w:color="000000"/>
+        </w:pBdr>
+        <w:shd w:val="clear" w:color="auto" w:fill="FFF2CC"/>
+      </w:pPr>
+      <w:r>
+        <w:t xml:space="preserve">    for </w:t>
+      </w:r>
+      <w:proofErr w:type="spellStart"/>
+      <w:r>
+        <w:t>arg</w:t>
+      </w:r>
+      <w:proofErr w:type="spellEnd"/>
+      <w:r>
+        <w:t xml:space="preserve"> in </w:t>
+      </w:r>
+      <w:proofErr w:type="spellStart"/>
+      <w:proofErr w:type="gramStart"/>
+      <w:r>
+        <w:t>sys.argv</w:t>
+      </w:r>
+      <w:proofErr w:type="spellEnd"/>
+      <w:proofErr w:type="gramEnd"/>
+      <w:r>
+        <w:t>[1:]:</w:t>
+      </w:r>
+    </w:p>
+    <w:p>
+      <w:pPr>
+        <w:pBdr>
+          <w:top w:val="single" w:sz="8" w:space="0" w:color="000000"/>
+          <w:left w:val="single" w:sz="8" w:space="0" w:color="000000"/>
+          <w:bottom w:val="single" w:sz="8" w:space="0" w:color="000000"/>
+          <w:right w:val="single" w:sz="8" w:space="0" w:color="000000"/>
+        </w:pBdr>
+        <w:shd w:val="clear" w:color="auto" w:fill="FFF2CC"/>
+      </w:pPr>
+      <w:r>
+        <w:t xml:space="preserve">        print(</w:t>
+      </w:r>
+      <w:proofErr w:type="spellStart"/>
+      <w:r>
+        <w:t>arg</w:t>
+      </w:r>
+      <w:proofErr w:type="spellEnd"/>
+      <w:r>
+        <w:t>)</w:t>
       </w:r>
     </w:p>
     <w:p>
@@ -999,7 +1153,15 @@
         <w:shd w:val="clear" w:color="auto" w:fill="FFF2CC"/>
       </w:pPr>
       <w:r>
-        <w:t xml:space="preserve">    print("no names provided")</w:t>
+        <w:t xml:space="preserve">    </w:t>
+      </w:r>
+      <w:proofErr w:type="gramStart"/>
+      <w:r>
+        <w:t>print(</w:t>
+      </w:r>
+      <w:proofErr w:type="gramEnd"/>
+      <w:r>
+        <w:t>"no names provided")</w:t>
       </w:r>
     </w:p>
     <w:p>
@@ -1027,7 +1189,15 @@
         <w:spacing w:before="240" w:after="240"/>
       </w:pPr>
       <w:r>
-        <w:t xml:space="preserve">When using an import statement it is possible to provide an </w:t>
+        <w:t xml:space="preserve">When using an import </w:t>
+      </w:r>
+      <w:proofErr w:type="gramStart"/>
+      <w:r>
+        <w:t>statement</w:t>
+      </w:r>
+      <w:proofErr w:type="gramEnd"/>
+      <w:r>
+        <w:t xml:space="preserve"> it is possible to provide an </w:t>
       </w:r>
       <w:r>
         <w:rPr>
@@ -1064,12 +1234,14 @@
       <w:r>
         <w:t xml:space="preserve"> module, and renames it to </w:t>
       </w:r>
+      <w:proofErr w:type="spellStart"/>
       <w:r>
         <w:rPr>
           <w:rFonts w:ascii="Courier New" w:eastAsia="Courier New" w:hAnsi="Courier New" w:cs="Courier New"/>
         </w:rPr>
         <w:t>my_system</w:t>
       </w:r>
+      <w:proofErr w:type="spellEnd"/>
       <w:r>
         <w:t>.</w:t>
       </w:r>
@@ -1099,8 +1271,13 @@
         <w:shd w:val="clear" w:color="auto" w:fill="FFF2CC"/>
       </w:pPr>
       <w:r>
-        <w:t>import sys as my_system</w:t>
-      </w:r>
+        <w:t xml:space="preserve">import sys as </w:t>
+      </w:r>
+      <w:proofErr w:type="spellStart"/>
+      <w:r>
+        <w:t>my_system</w:t>
+      </w:r>
+      <w:proofErr w:type="spellEnd"/>
     </w:p>
     <w:p>
       <w:pPr>
@@ -1120,21 +1297,33 @@
       <w:r>
         <w:t xml:space="preserve">Write a </w:t>
       </w:r>
-      <w:r>
-        <w:rPr>
-          <w:b/>
-        </w:rPr>
-        <w:t>from..import</w:t>
-      </w:r>
+      <w:proofErr w:type="spellStart"/>
+      <w:proofErr w:type="gramStart"/>
+      <w:r>
+        <w:rPr>
+          <w:b/>
+        </w:rPr>
+        <w:t>from..</w:t>
+      </w:r>
+      <w:proofErr w:type="gramEnd"/>
+      <w:r>
+        <w:rPr>
+          <w:b/>
+        </w:rPr>
+        <w:t>import</w:t>
+      </w:r>
+      <w:proofErr w:type="spellEnd"/>
       <w:r>
         <w:t xml:space="preserve"> statement that imports only the </w:t>
       </w:r>
+      <w:proofErr w:type="spellStart"/>
       <w:r>
         <w:rPr>
           <w:rFonts w:ascii="Courier New" w:eastAsia="Courier New" w:hAnsi="Courier New" w:cs="Courier New"/>
         </w:rPr>
         <w:t>math.floor</w:t>
       </w:r>
+      <w:proofErr w:type="spellEnd"/>
       <w:r>
         <w:t xml:space="preserve"> function, and renames it to </w:t>
       </w:r>
@@ -1323,61 +1512,49 @@
         <w:shd w:val="clear" w:color="auto" w:fill="FFF2CC"/>
       </w:pPr>
       <w:r>
-        <w:t>-</w:t>
-      </w:r>
-      <w:r>
-        <w:t>Imports all names into the current namespace</w:t>
-      </w:r>
-    </w:p>
-    <w:p>
-      <w:pPr>
-        <w:pBdr>
-          <w:top w:val="single" w:sz="8" w:space="0" w:color="000000"/>
-          <w:left w:val="single" w:sz="8" w:space="0" w:color="000000"/>
-          <w:bottom w:val="single" w:sz="8" w:space="0" w:color="000000"/>
-          <w:right w:val="single" w:sz="8" w:space="0" w:color="000000"/>
-        </w:pBdr>
-        <w:shd w:val="clear" w:color="auto" w:fill="FFF2CC"/>
-      </w:pPr>
-      <w:r>
-        <w:t>-</w:t>
-      </w:r>
-      <w:r>
-        <w:t>Can cause name conflicts</w:t>
-      </w:r>
-    </w:p>
-    <w:p>
-      <w:pPr>
-        <w:pBdr>
-          <w:top w:val="single" w:sz="8" w:space="0" w:color="000000"/>
-          <w:left w:val="single" w:sz="8" w:space="0" w:color="000000"/>
-          <w:bottom w:val="single" w:sz="8" w:space="0" w:color="000000"/>
-          <w:right w:val="single" w:sz="8" w:space="0" w:color="000000"/>
-        </w:pBdr>
-        <w:shd w:val="clear" w:color="auto" w:fill="FFF2CC"/>
-      </w:pPr>
-      <w:r>
-        <w:t>-</w:t>
-      </w:r>
-      <w:r>
-        <w:t>Makes code harder to understand and maintain</w:t>
-      </w:r>
-    </w:p>
-    <w:p>
-      <w:pPr>
-        <w:pBdr>
-          <w:top w:val="single" w:sz="8" w:space="0" w:color="000000"/>
-          <w:left w:val="single" w:sz="8" w:space="0" w:color="000000"/>
-          <w:bottom w:val="single" w:sz="8" w:space="0" w:color="000000"/>
-          <w:right w:val="single" w:sz="8" w:space="0" w:color="000000"/>
-        </w:pBdr>
-        <w:shd w:val="clear" w:color="auto" w:fill="FFF2CC"/>
-      </w:pPr>
-      <w:r>
-        <w:t>-</w:t>
-      </w:r>
-      <w:r>
-        <w:t>Obscures the origin of functions and variables</w:t>
+        <w:t>-Imports all names into the current namespace</w:t>
+      </w:r>
+    </w:p>
+    <w:p>
+      <w:pPr>
+        <w:pBdr>
+          <w:top w:val="single" w:sz="8" w:space="0" w:color="000000"/>
+          <w:left w:val="single" w:sz="8" w:space="0" w:color="000000"/>
+          <w:bottom w:val="single" w:sz="8" w:space="0" w:color="000000"/>
+          <w:right w:val="single" w:sz="8" w:space="0" w:color="000000"/>
+        </w:pBdr>
+        <w:shd w:val="clear" w:color="auto" w:fill="FFF2CC"/>
+      </w:pPr>
+      <w:r>
+        <w:t>-Can cause name conflicts</w:t>
+      </w:r>
+    </w:p>
+    <w:p>
+      <w:pPr>
+        <w:pBdr>
+          <w:top w:val="single" w:sz="8" w:space="0" w:color="000000"/>
+          <w:left w:val="single" w:sz="8" w:space="0" w:color="000000"/>
+          <w:bottom w:val="single" w:sz="8" w:space="0" w:color="000000"/>
+          <w:right w:val="single" w:sz="8" w:space="0" w:color="000000"/>
+        </w:pBdr>
+        <w:shd w:val="clear" w:color="auto" w:fill="FFF2CC"/>
+      </w:pPr>
+      <w:r>
+        <w:t>-Makes code harder to understand and maintain</w:t>
+      </w:r>
+    </w:p>
+    <w:p>
+      <w:pPr>
+        <w:pBdr>
+          <w:top w:val="single" w:sz="8" w:space="0" w:color="000000"/>
+          <w:left w:val="single" w:sz="8" w:space="0" w:color="000000"/>
+          <w:bottom w:val="single" w:sz="8" w:space="0" w:color="000000"/>
+          <w:right w:val="single" w:sz="8" w:space="0" w:color="000000"/>
+        </w:pBdr>
+        <w:shd w:val="clear" w:color="auto" w:fill="FFF2CC"/>
+      </w:pPr>
+      <w:r>
+        <w:t>-Obscures the origin of functions and variables</w:t>
       </w:r>
     </w:p>
     <w:p>
@@ -1432,8 +1609,18 @@
         </w:pBdr>
         <w:shd w:val="clear" w:color="auto" w:fill="FFF2CC"/>
       </w:pPr>
-      <w:r>
-        <w:t>dir()</w:t>
+      <w:proofErr w:type="spellStart"/>
+      <w:proofErr w:type="gramStart"/>
+      <w:r>
+        <w:t>dir</w:t>
+      </w:r>
+      <w:proofErr w:type="spellEnd"/>
+      <w:r>
+        <w:t>(</w:t>
+      </w:r>
+      <w:proofErr w:type="gramEnd"/>
+      <w:r>
+        <w:t>)</w:t>
       </w:r>
     </w:p>
     <w:p>
@@ -1473,12 +1660,16 @@
       <w:r>
         <w:t xml:space="preserve">What is the value stored within the </w:t>
       </w:r>
+      <w:proofErr w:type="spellStart"/>
+      <w:proofErr w:type="gramStart"/>
       <w:r>
         <w:rPr>
           <w:rFonts w:ascii="Courier New" w:eastAsia="Courier New" w:hAnsi="Courier New" w:cs="Courier New"/>
         </w:rPr>
         <w:t>sys.path</w:t>
       </w:r>
+      <w:proofErr w:type="spellEnd"/>
+      <w:proofErr w:type="gramEnd"/>
       <w:r>
         <w:t xml:space="preserve"> variable used for?</w:t>
       </w:r>
@@ -1507,8 +1698,15 @@
         </w:pBdr>
         <w:shd w:val="clear" w:color="auto" w:fill="FFF2CC"/>
       </w:pPr>
-      <w:r>
-        <w:t xml:space="preserve">sys.path </w:t>
+      <w:proofErr w:type="spellStart"/>
+      <w:proofErr w:type="gramStart"/>
+      <w:r>
+        <w:t>sys.path</w:t>
+      </w:r>
+      <w:proofErr w:type="spellEnd"/>
+      <w:proofErr w:type="gramEnd"/>
+      <w:r>
+        <w:t xml:space="preserve"> </w:t>
       </w:r>
       <w:r>
         <w:t>contains a list of directories where Python looks for modules to import.</w:t>
@@ -1636,10 +1834,21 @@
         <w:rPr>
           <w:rFonts w:ascii="Varela Round" w:eastAsia="Varela Round" w:hAnsi="Varela Round" w:cs="Varela Round"/>
         </w:rPr>
-        <w:t>__</w:t>
-      </w:r>
-      <w:r>
-        <w:t xml:space="preserve">  variable when a program has been imported as a </w:t>
+        <w:t>_</w:t>
+      </w:r>
+      <w:proofErr w:type="gramStart"/>
+      <w:r>
+        <w:rPr>
+          <w:rFonts w:ascii="Varela Round" w:eastAsia="Varela Round" w:hAnsi="Varela Round" w:cs="Varela Round"/>
+        </w:rPr>
+        <w:t>_</w:t>
+      </w:r>
+      <w:r>
+        <w:t xml:space="preserve">  variable</w:t>
+      </w:r>
+      <w:proofErr w:type="gramEnd"/>
+      <w:r>
+        <w:t xml:space="preserve"> when a program has been imported as a </w:t>
       </w:r>
       <w:r>
         <w:rPr>
@@ -1900,6 +2109,56 @@
     </w:sectPr>
   </w:body>
 </w:document>
+</file>
+
+<file path=word/endnotes.xml><?xml version="1.0" encoding="utf-8"?>
+<w:endnotes xmlns:wpc="http://schemas.microsoft.com/office/word/2010/wordprocessingCanvas" xmlns:cx="http://schemas.microsoft.com/office/drawing/2014/chartex" xmlns:cx1="http://schemas.microsoft.com/office/drawing/2015/9/8/chartex" xmlns:cx2="http://schemas.microsoft.com/office/drawing/2015/10/21/chartex" xmlns:cx3="http://schemas.microsoft.com/office/drawing/2016/5/9/chartex" xmlns:cx4="http://schemas.microsoft.com/office/drawing/2016/5/10/chartex" xmlns:cx5="http://schemas.microsoft.com/office/drawing/2016/5/11/chartex" xmlns:cx6="http://schemas.microsoft.com/office/drawing/2016/5/12/chartex" xmlns:cx7="http://schemas.microsoft.com/office/drawing/2016/5/13/chartex" xmlns:cx8="http://schemas.microsoft.com/office/drawing/2016/5/14/chartex" xmlns:mc="http://schemas.openxmlformats.org/markup-compatibility/2006" xmlns:aink="http://schemas.microsoft.com/office/drawing/2016/ink" xmlns:am3d="http://schemas.microsoft.com/office/drawing/2017/model3d" xmlns:o="urn:schemas-microsoft-com:office:office" xmlns:oel="http://schemas.microsoft.com/office/2019/extlst" xmlns:r="http://schemas.openxmlformats.org/officeDocument/2006/relationships" xmlns:m="http://schemas.openxmlformats.org/officeDocument/2006/math" xmlns:v="urn:schemas-microsoft-com:vml" xmlns:wp14="http://schemas.microsoft.com/office/word/2010/wordprocessingDrawing" xmlns:wp="http://schemas.openxmlformats.org/drawingml/2006/wordprocessingDrawing" xmlns:w10="urn:schemas-microsoft-com:office:word" xmlns:w="http://schemas.openxmlformats.org/wordprocessingml/2006/main" xmlns:w14="http://schemas.microsoft.com/office/word/2010/wordml" xmlns:w15="http://schemas.microsoft.com/office/word/2012/wordml" xmlns:w16cex="http://schemas.microsoft.com/office/word/2018/wordml/cex" xmlns:w16cid="http://schemas.microsoft.com/office/word/2016/wordml/cid" xmlns:w16="http://schemas.microsoft.com/office/word/2018/wordml" xmlns:w16du="http://schemas.microsoft.com/office/word/2023/wordml/word16du" xmlns:w16sdtdh="http://schemas.microsoft.com/office/word/2020/wordml/sdtdatahash" xmlns:w16se="http://schemas.microsoft.com/office/word/2015/wordml/symex" xmlns:wpg="http://schemas.microsoft.com/office/word/2010/wordprocessingGroup" xmlns:wpi="http://schemas.microsoft.com/office/word/2010/wordprocessingInk" xmlns:wne="http://schemas.microsoft.com/office/word/2006/wordml" xmlns:wps="http://schemas.microsoft.com/office/word/2010/wordprocessingShape" mc:Ignorable="w14 w15 w16se w16cid w16 w16cex w16sdtdh w16du wp14">
+  <w:endnote w:type="separator" w:id="-1">
+    <w:p>
+      <w:pPr>
+        <w:spacing w:line="240" w:lineRule="auto"/>
+      </w:pPr>
+      <w:r>
+        <w:separator/>
+      </w:r>
+    </w:p>
+  </w:endnote>
+  <w:endnote w:type="continuationSeparator" w:id="0">
+    <w:p>
+      <w:pPr>
+        <w:spacing w:line="240" w:lineRule="auto"/>
+      </w:pPr>
+      <w:r>
+        <w:continuationSeparator/>
+      </w:r>
+    </w:p>
+  </w:endnote>
+</w:endnotes>
+</file>
+
+<file path=word/footnotes.xml><?xml version="1.0" encoding="utf-8"?>
+<w:footnotes xmlns:wpc="http://schemas.microsoft.com/office/word/2010/wordprocessingCanvas" xmlns:cx="http://schemas.microsoft.com/office/drawing/2014/chartex" xmlns:cx1="http://schemas.microsoft.com/office/drawing/2015/9/8/chartex" xmlns:cx2="http://schemas.microsoft.com/office/drawing/2015/10/21/chartex" xmlns:cx3="http://schemas.microsoft.com/office/drawing/2016/5/9/chartex" xmlns:cx4="http://schemas.microsoft.com/office/drawing/2016/5/10/chartex" xmlns:cx5="http://schemas.microsoft.com/office/drawing/2016/5/11/chartex" xmlns:cx6="http://schemas.microsoft.com/office/drawing/2016/5/12/chartex" xmlns:cx7="http://schemas.microsoft.com/office/drawing/2016/5/13/chartex" xmlns:cx8="http://schemas.microsoft.com/office/drawing/2016/5/14/chartex" xmlns:mc="http://schemas.openxmlformats.org/markup-compatibility/2006" xmlns:aink="http://schemas.microsoft.com/office/drawing/2016/ink" xmlns:am3d="http://schemas.microsoft.com/office/drawing/2017/model3d" xmlns:o="urn:schemas-microsoft-com:office:office" xmlns:oel="http://schemas.microsoft.com/office/2019/extlst" xmlns:r="http://schemas.openxmlformats.org/officeDocument/2006/relationships" xmlns:m="http://schemas.openxmlformats.org/officeDocument/2006/math" xmlns:v="urn:schemas-microsoft-com:vml" xmlns:wp14="http://schemas.microsoft.com/office/word/2010/wordprocessingDrawing" xmlns:wp="http://schemas.openxmlformats.org/drawingml/2006/wordprocessingDrawing" xmlns:w10="urn:schemas-microsoft-com:office:word" xmlns:w="http://schemas.openxmlformats.org/wordprocessingml/2006/main" xmlns:w14="http://schemas.microsoft.com/office/word/2010/wordml" xmlns:w15="http://schemas.microsoft.com/office/word/2012/wordml" xmlns:w16cex="http://schemas.microsoft.com/office/word/2018/wordml/cex" xmlns:w16cid="http://schemas.microsoft.com/office/word/2016/wordml/cid" xmlns:w16="http://schemas.microsoft.com/office/word/2018/wordml" xmlns:w16du="http://schemas.microsoft.com/office/word/2023/wordml/word16du" xmlns:w16sdtdh="http://schemas.microsoft.com/office/word/2020/wordml/sdtdatahash" xmlns:w16se="http://schemas.microsoft.com/office/word/2015/wordml/symex" xmlns:wpg="http://schemas.microsoft.com/office/word/2010/wordprocessingGroup" xmlns:wpi="http://schemas.microsoft.com/office/word/2010/wordprocessingInk" xmlns:wne="http://schemas.microsoft.com/office/word/2006/wordml" xmlns:wps="http://schemas.microsoft.com/office/word/2010/wordprocessingShape" mc:Ignorable="w14 w15 w16se w16cid w16 w16cex w16sdtdh w16du wp14">
+  <w:footnote w:type="separator" w:id="-1">
+    <w:p>
+      <w:pPr>
+        <w:spacing w:line="240" w:lineRule="auto"/>
+      </w:pPr>
+      <w:r>
+        <w:separator/>
+      </w:r>
+    </w:p>
+  </w:footnote>
+  <w:footnote w:type="continuationSeparator" w:id="0">
+    <w:p>
+      <w:pPr>
+        <w:spacing w:line="240" w:lineRule="auto"/>
+      </w:pPr>
+      <w:r>
+        <w:continuationSeparator/>
+      </w:r>
+    </w:p>
+  </w:footnote>
+</w:footnotes>
 </file>
 
 <file path=word/numbering.xml><?xml version="1.0" encoding="utf-8"?>
@@ -2536,6 +2795,7 @@
   <w:style w:type="character" w:default="1" w:styleId="DefaultParagraphFont">
     <w:name w:val="Default Paragraph Font"/>
     <w:uiPriority w:val="1"/>
+    <w:semiHidden/>
     <w:unhideWhenUsed/>
   </w:style>
   <w:style w:type="table" w:default="1" w:styleId="TableNormal">
@@ -2591,6 +2851,50 @@
       <w:sz w:val="30"/>
       <w:szCs w:val="30"/>
     </w:rPr>
+  </w:style>
+  <w:style w:type="paragraph" w:styleId="Header">
+    <w:name w:val="header"/>
+    <w:basedOn w:val="Normal"/>
+    <w:link w:val="HeaderChar"/>
+    <w:uiPriority w:val="99"/>
+    <w:unhideWhenUsed/>
+    <w:rsid w:val="00296617"/>
+    <w:pPr>
+      <w:tabs>
+        <w:tab w:val="center" w:pos="4680"/>
+        <w:tab w:val="right" w:pos="9360"/>
+      </w:tabs>
+      <w:spacing w:line="240" w:lineRule="auto"/>
+    </w:pPr>
+  </w:style>
+  <w:style w:type="character" w:customStyle="1" w:styleId="HeaderChar">
+    <w:name w:val="Header Char"/>
+    <w:basedOn w:val="DefaultParagraphFont"/>
+    <w:link w:val="Header"/>
+    <w:uiPriority w:val="99"/>
+    <w:rsid w:val="00296617"/>
+  </w:style>
+  <w:style w:type="paragraph" w:styleId="Footer">
+    <w:name w:val="footer"/>
+    <w:basedOn w:val="Normal"/>
+    <w:link w:val="FooterChar"/>
+    <w:uiPriority w:val="99"/>
+    <w:unhideWhenUsed/>
+    <w:rsid w:val="00296617"/>
+    <w:pPr>
+      <w:tabs>
+        <w:tab w:val="center" w:pos="4680"/>
+        <w:tab w:val="right" w:pos="9360"/>
+      </w:tabs>
+      <w:spacing w:line="240" w:lineRule="auto"/>
+    </w:pPr>
+  </w:style>
+  <w:style w:type="character" w:customStyle="1" w:styleId="FooterChar">
+    <w:name w:val="Footer Char"/>
+    <w:basedOn w:val="DefaultParagraphFont"/>
+    <w:link w:val="Footer"/>
+    <w:uiPriority w:val="99"/>
+    <w:rsid w:val="00296617"/>
   </w:style>
 </w:styles>
 </file>

</xml_diff>